<commit_message>
STU-NF004: record usability test results (TC-UX-01)
</commit_message>
<xml_diff>
--- a/docs/Student_Record_System_Test_Plan.docx
+++ b/docs/Student_Record_System_Test_Plan.docx
@@ -7,51 +7,51 @@
         <w:jc w:val="center"/>
         <w:rPr>
           <w:b/>
-          <w:color w:val="0070C0"/>
+          <w:color w:val="000000" w:themeColor="text1"/>
           <w:sz w:val="32"/>
         </w:rPr>
       </w:pPr>
-      <w:r>
-        <w:rPr>
-          <w:b/>
-          <w:color w:val="0070C0"/>
-          <w:sz w:val="32"/>
-        </w:rPr>
-        <w:t>SOFTWARE TEST PLAN (STP)</w:t>
-      </w:r>
-      <w:r>
-        <w:rPr>
-          <w:b/>
-          <w:color w:val="0070C0"/>
-          <w:sz w:val="32"/>
-        </w:rPr>
-        <w:br/>
-        <w:t>STUDENT RECORD SYSTEM</w:t>
-      </w:r>
-    </w:p>
-    <w:p>
-      <w:pPr>
-        <w:jc w:val="center"/>
-        <w:rPr>
-          <w:color w:val="000000" w:themeColor="text1"/>
-        </w:rPr>
-      </w:pPr>
-      <w:proofErr w:type="gramStart"/>
       <w:r>
         <w:rPr>
           <w:b/>
           <w:color w:val="000000" w:themeColor="text1"/>
           <w:sz w:val="32"/>
         </w:rPr>
-        <w:t>COURSE :</w:t>
-      </w:r>
-      <w:proofErr w:type="gramEnd"/>
+        <w:t>SOFTWARE TEST PLAN (STP)</w:t>
+      </w:r>
       <w:r>
         <w:rPr>
           <w:b/>
           <w:color w:val="000000" w:themeColor="text1"/>
           <w:sz w:val="32"/>
         </w:rPr>
+        <w:br/>
+        <w:t>STUDENT RECORD SYSTEM</w:t>
+      </w:r>
+    </w:p>
+    <w:p>
+      <w:pPr>
+        <w:jc w:val="center"/>
+        <w:rPr>
+          <w:color w:val="000000" w:themeColor="text1"/>
+        </w:rPr>
+      </w:pPr>
+      <w:proofErr w:type="gramStart"/>
+      <w:r>
+        <w:rPr>
+          <w:b/>
+          <w:color w:val="000000" w:themeColor="text1"/>
+          <w:sz w:val="32"/>
+        </w:rPr>
+        <w:t>COURSE :</w:t>
+      </w:r>
+      <w:proofErr w:type="gramEnd"/>
+      <w:r>
+        <w:rPr>
+          <w:b/>
+          <w:color w:val="000000" w:themeColor="text1"/>
+          <w:sz w:val="32"/>
+        </w:rPr>
         <w:t xml:space="preserve"> SOFTWARE ENGINEERING</w:t>
       </w:r>
     </w:p>
@@ -67,7 +67,7 @@
           <w:rFonts w:ascii="Arial" w:hAnsi="Arial"/>
           <w:b/>
           <w:bCs/>
-          <w:color w:val="0070C0"/>
+          <w:color w:val="000000" w:themeColor="text1"/>
           <w:sz w:val="24"/>
           <w:szCs w:val="28"/>
         </w:rPr>
@@ -2079,17 +2079,17 @@
           </w:tcPr>
           <w:p>
             <w:r>
-              <w:t>STU-F-002 – Masked password entry (manual)</w:t>
-            </w:r>
-          </w:p>
-        </w:tc>
-        <w:tc>
-          <w:tcPr>
-            <w:tcW w:w="4320" w:type="dxa"/>
-          </w:tcPr>
-          <w:p>
-            <w:r>
-              <w:t>TC-Auth-02M</w:t>
+              <w:t>STU-F-003 – Account lockout</w:t>
+            </w:r>
+          </w:p>
+        </w:tc>
+        <w:tc>
+          <w:tcPr>
+            <w:tcW w:w="4320" w:type="dxa"/>
+          </w:tcPr>
+          <w:p>
+            <w:r>
+              <w:t>TC-Auth-03</w:t>
             </w:r>
           </w:p>
         </w:tc>
@@ -2104,17 +2104,17 @@
           </w:tcPr>
           <w:p>
             <w:r>
-              <w:t>STU-F-003 – Account lockout</w:t>
-            </w:r>
-          </w:p>
-        </w:tc>
-        <w:tc>
-          <w:tcPr>
-            <w:tcW w:w="4320" w:type="dxa"/>
-          </w:tcPr>
-          <w:p>
-            <w:r>
-              <w:t>TC-Auth-03</w:t>
+              <w:t>STU-F-004 – Role-based access</w:t>
+            </w:r>
+          </w:p>
+        </w:tc>
+        <w:tc>
+          <w:tcPr>
+            <w:tcW w:w="4320" w:type="dxa"/>
+          </w:tcPr>
+          <w:p>
+            <w:r>
+              <w:t>TC-Auth-04</w:t>
             </w:r>
           </w:p>
         </w:tc>
@@ -2129,17 +2129,17 @@
           </w:tcPr>
           <w:p>
             <w:r>
-              <w:t>STU-F-004 – Role-based access</w:t>
-            </w:r>
-          </w:p>
-        </w:tc>
-        <w:tc>
-          <w:tcPr>
-            <w:tcW w:w="4320" w:type="dxa"/>
-          </w:tcPr>
-          <w:p>
-            <w:r>
-              <w:t>TC-Auth-04</w:t>
+              <w:t>STU-F-010 – Add student</w:t>
+            </w:r>
+          </w:p>
+        </w:tc>
+        <w:tc>
+          <w:tcPr>
+            <w:tcW w:w="4320" w:type="dxa"/>
+          </w:tcPr>
+          <w:p>
+            <w:r>
+              <w:t>TC-Rec-01</w:t>
             </w:r>
           </w:p>
         </w:tc>
@@ -2154,17 +2154,17 @@
           </w:tcPr>
           <w:p>
             <w:r>
-              <w:t>STU-F-010 – Add student</w:t>
-            </w:r>
-          </w:p>
-        </w:tc>
-        <w:tc>
-          <w:tcPr>
-            <w:tcW w:w="4320" w:type="dxa"/>
-          </w:tcPr>
-          <w:p>
-            <w:r>
-              <w:t>TC-Rec-01</w:t>
+              <w:t>STU-F-011 – Update student</w:t>
+            </w:r>
+          </w:p>
+        </w:tc>
+        <w:tc>
+          <w:tcPr>
+            <w:tcW w:w="4320" w:type="dxa"/>
+          </w:tcPr>
+          <w:p>
+            <w:r>
+              <w:t>TC-Rec-02</w:t>
             </w:r>
           </w:p>
         </w:tc>
@@ -2179,17 +2179,17 @@
           </w:tcPr>
           <w:p>
             <w:r>
-              <w:t>STU-F-011 – Update student</w:t>
-            </w:r>
-          </w:p>
-        </w:tc>
-        <w:tc>
-          <w:tcPr>
-            <w:tcW w:w="4320" w:type="dxa"/>
-          </w:tcPr>
-          <w:p>
-            <w:r>
-              <w:t>TC-Rec-02</w:t>
+              <w:t>STU-F-012 – Delete student</w:t>
+            </w:r>
+          </w:p>
+        </w:tc>
+        <w:tc>
+          <w:tcPr>
+            <w:tcW w:w="4320" w:type="dxa"/>
+          </w:tcPr>
+          <w:p>
+            <w:r>
+              <w:t>TC-Rec-03</w:t>
             </w:r>
           </w:p>
         </w:tc>
@@ -2204,17 +2204,17 @@
           </w:tcPr>
           <w:p>
             <w:r>
-              <w:t>STU-F-012 – Delete student</w:t>
-            </w:r>
-          </w:p>
-        </w:tc>
-        <w:tc>
-          <w:tcPr>
-            <w:tcW w:w="4320" w:type="dxa"/>
-          </w:tcPr>
-          <w:p>
-            <w:r>
-              <w:t>TC-Rec-03</w:t>
+              <w:t>STU-F-013 – Duplicate roll number</w:t>
+            </w:r>
+          </w:p>
+        </w:tc>
+        <w:tc>
+          <w:tcPr>
+            <w:tcW w:w="4320" w:type="dxa"/>
+          </w:tcPr>
+          <w:p>
+            <w:r>
+              <w:t>TC-Rec-04</w:t>
             </w:r>
           </w:p>
         </w:tc>
@@ -2229,17 +2229,17 @@
           </w:tcPr>
           <w:p>
             <w:r>
-              <w:t>STU-F-013 – Duplicate roll number</w:t>
-            </w:r>
-          </w:p>
-        </w:tc>
-        <w:tc>
-          <w:tcPr>
-            <w:tcW w:w="4320" w:type="dxa"/>
-          </w:tcPr>
-          <w:p>
-            <w:r>
-              <w:t>TC-Rec-04</w:t>
+              <w:t>STU-F-020 – Record/update marks</w:t>
+            </w:r>
+          </w:p>
+        </w:tc>
+        <w:tc>
+          <w:tcPr>
+            <w:tcW w:w="4320" w:type="dxa"/>
+          </w:tcPr>
+          <w:p>
+            <w:r>
+              <w:t>TC-Grade-01</w:t>
             </w:r>
           </w:p>
         </w:tc>
@@ -2254,17 +2254,17 @@
           </w:tcPr>
           <w:p>
             <w:r>
-              <w:t>STU-F-020 – Record/update marks</w:t>
-            </w:r>
-          </w:p>
-        </w:tc>
-        <w:tc>
-          <w:tcPr>
-            <w:tcW w:w="4320" w:type="dxa"/>
-          </w:tcPr>
-          <w:p>
-            <w:r>
-              <w:t>TC-Grade-01</w:t>
+              <w:t>STU-F-030 – Mark attendance</w:t>
+            </w:r>
+          </w:p>
+        </w:tc>
+        <w:tc>
+          <w:tcPr>
+            <w:tcW w:w="4320" w:type="dxa"/>
+          </w:tcPr>
+          <w:p>
+            <w:r>
+              <w:t>TC-Att-01</w:t>
             </w:r>
           </w:p>
         </w:tc>
@@ -2279,17 +2279,17 @@
           </w:tcPr>
           <w:p>
             <w:r>
-              <w:t>STU-F-030 – Mark attendance</w:t>
-            </w:r>
-          </w:p>
-        </w:tc>
-        <w:tc>
-          <w:tcPr>
-            <w:tcW w:w="4320" w:type="dxa"/>
-          </w:tcPr>
-          <w:p>
-            <w:r>
-              <w:t>TC-Att-01</w:t>
+              <w:t>STU-F-040 – Search student</w:t>
+            </w:r>
+          </w:p>
+        </w:tc>
+        <w:tc>
+          <w:tcPr>
+            <w:tcW w:w="4320" w:type="dxa"/>
+          </w:tcPr>
+          <w:p>
+            <w:r>
+              <w:t>TC-Rpt-01</w:t>
             </w:r>
           </w:p>
         </w:tc>
@@ -2304,17 +2304,17 @@
           </w:tcPr>
           <w:p>
             <w:r>
-              <w:t>STU-F-040 – Search student</w:t>
-            </w:r>
-          </w:p>
-        </w:tc>
-        <w:tc>
-          <w:tcPr>
-            <w:tcW w:w="4320" w:type="dxa"/>
-          </w:tcPr>
-          <w:p>
-            <w:r>
-              <w:t>TC-Rpt-01</w:t>
+              <w:t>STU-NF-001 – Response time</w:t>
+            </w:r>
+          </w:p>
+        </w:tc>
+        <w:tc>
+          <w:tcPr>
+            <w:tcW w:w="4320" w:type="dxa"/>
+          </w:tcPr>
+          <w:p>
+            <w:r>
+              <w:t>TC-Perf-01</w:t>
             </w:r>
           </w:p>
         </w:tc>
@@ -2329,17 +2329,17 @@
           </w:tcPr>
           <w:p>
             <w:r>
-              <w:t>STU-NF-001 – Response time</w:t>
-            </w:r>
-          </w:p>
-        </w:tc>
-        <w:tc>
-          <w:tcPr>
-            <w:tcW w:w="4320" w:type="dxa"/>
-          </w:tcPr>
-          <w:p>
-            <w:r>
-              <w:t>TC-Perf-01</w:t>
+              <w:t>STU-NF-002 – Data reliability</w:t>
+            </w:r>
+          </w:p>
+        </w:tc>
+        <w:tc>
+          <w:tcPr>
+            <w:tcW w:w="4320" w:type="dxa"/>
+          </w:tcPr>
+          <w:p>
+            <w:r>
+              <w:t>TC-Rel-01</w:t>
             </w:r>
           </w:p>
         </w:tc>
@@ -2354,31 +2354,6 @@
           </w:tcPr>
           <w:p>
             <w:r>
-              <w:t>STU-NF-002 – Data reliability</w:t>
-            </w:r>
-          </w:p>
-        </w:tc>
-        <w:tc>
-          <w:tcPr>
-            <w:tcW w:w="4320" w:type="dxa"/>
-          </w:tcPr>
-          <w:p>
-            <w:r>
-              <w:t>TC-Rel-01</w:t>
-            </w:r>
-          </w:p>
-        </w:tc>
-      </w:tr>
-      <w:tr>
-        <w:trPr>
-          <w:trHeight w:val="567"/>
-        </w:trPr>
-        <w:tc>
-          <w:tcPr>
-            <w:tcW w:w="4320" w:type="dxa"/>
-          </w:tcPr>
-          <w:p>
-            <w:r>
               <w:t>STU-SR-003 – Audit logging</w:t>
             </w:r>
           </w:p>
@@ -2390,338 +2365,6 @@
           <w:p>
             <w:r>
               <w:t>TC-Sec-04</w:t>
-            </w:r>
-          </w:p>
-        </w:tc>
-      </w:tr>
-    </w:tbl>
-    <w:p/>
-    <w:p>
-      <w:r>
-        <w:rPr>
-          <w:rFonts w:ascii="Arial" w:hAnsi="Arial"/>
-          <w:b/>
-          <w:sz w:val="23"/>
-        </w:rPr>
-        <w:t>Manual test case: TC-Auth-02M (Sprint 1)</w:t>
-      </w:r>
-    </w:p>
-    <w:tbl>
-      <w:tblPr>
-        <w:tblStyle w:val="TableGrid"/>
-        <w:tblW w:w="0" w:type="auto"/>
-        <w:tblLook w:val="04A0" w:firstRow="1" w:lastRow="0" w:firstColumn="1" w:lastColumn="0" w:noHBand="0" w:noVBand="1"/>
-      </w:tblPr>
-      <w:tblGrid>
-        <w:gridCol w:w="2200"/>
-        <w:gridCol w:w="6430"/>
-      </w:tblGrid>
-      <w:tr>
-        <w:tc>
-          <w:tcPr>
-            <w:tcW w:w="2200" w:type="dxa"/>
-          </w:tcPr>
-          <w:p>
-            <w:r>
-              <w:rPr>
-                <w:rFonts w:ascii="Arial" w:hAnsi="Arial"/>
-                <w:b/>
-                <w:sz w:val="20"/>
-              </w:rPr>
-              <w:t xml:space="preserve">Test ID</w:t>
-            </w:r>
-          </w:p>
-        </w:tc>
-        <w:tc>
-          <w:tcPr>
-            <w:tcW w:w="6430" w:type="dxa"/>
-          </w:tcPr>
-          <w:p>
-            <w:r>
-              <w:rPr>
-                <w:rFonts w:ascii="Arial" w:hAnsi="Arial"/>
-                <w:sz w:val="20"/>
-              </w:rPr>
-              <w:t xml:space="preserve">TC-Auth-02M</w:t>
-            </w:r>
-          </w:p>
-        </w:tc>
-      </w:tr>
-      <w:tr>
-        <w:tc>
-          <w:tcPr>
-            <w:tcW w:w="2200" w:type="dxa"/>
-          </w:tcPr>
-          <w:p>
-            <w:r>
-              <w:rPr>
-                <w:rFonts w:ascii="Arial" w:hAnsi="Arial"/>
-                <w:b/>
-                <w:sz w:val="20"/>
-              </w:rPr>
-              <w:t xml:space="preserve">Requirement</w:t>
-            </w:r>
-          </w:p>
-        </w:tc>
-        <w:tc>
-          <w:tcPr>
-            <w:tcW w:w="6430" w:type="dxa"/>
-          </w:tcPr>
-          <w:p>
-            <w:r>
-              <w:rPr>
-                <w:rFonts w:ascii="Arial" w:hAnsi="Arial"/>
-                <w:sz w:val="20"/>
-              </w:rPr>
-              <w:t xml:space="preserve">STU-F-002 (password characters are not echoed on screen)</w:t>
-            </w:r>
-          </w:p>
-        </w:tc>
-      </w:tr>
-      <w:tr>
-        <w:tc>
-          <w:tcPr>
-            <w:tcW w:w="2200" w:type="dxa"/>
-          </w:tcPr>
-          <w:p>
-            <w:r>
-              <w:rPr>
-                <w:rFonts w:ascii="Arial" w:hAnsi="Arial"/>
-                <w:b/>
-                <w:sz w:val="20"/>
-              </w:rPr>
-              <w:t xml:space="preserve">Type</w:t>
-            </w:r>
-          </w:p>
-        </w:tc>
-        <w:tc>
-          <w:tcPr>
-            <w:tcW w:w="6430" w:type="dxa"/>
-          </w:tcPr>
-          <w:p>
-            <w:r>
-              <w:rPr>
-                <w:rFonts w:ascii="Arial" w:hAnsi="Arial"/>
-                <w:sz w:val="20"/>
-              </w:rPr>
-              <w:t xml:space="preserve">Manual</w:t>
-            </w:r>
-          </w:p>
-        </w:tc>
-      </w:tr>
-      <w:tr>
-        <w:tc>
-          <w:tcPr>
-            <w:tcW w:w="2200" w:type="dxa"/>
-          </w:tcPr>
-          <w:p>
-            <w:r>
-              <w:rPr>
-                <w:rFonts w:ascii="Arial" w:hAnsi="Arial"/>
-                <w:b/>
-                <w:sz w:val="20"/>
-              </w:rPr>
-              <w:t xml:space="preserve">Preconditions</w:t>
-            </w:r>
-          </w:p>
-        </w:tc>
-        <w:tc>
-          <w:tcPr>
-            <w:tcW w:w="6430" w:type="dxa"/>
-          </w:tcPr>
-          <w:p>
-            <w:r>
-              <w:rPr>
-                <w:rFonts w:ascii="Arial" w:hAnsi="Arial"/>
-                <w:sz w:val="20"/>
-              </w:rPr>
-              <w:t xml:space="preserve">Project built with GCC. Program tests/manual/manual_password.c compiled to manual_password.exe. Run from Windows Command Prompt (a real console is required).</w:t>
-            </w:r>
-          </w:p>
-        </w:tc>
-      </w:tr>
-      <w:tr>
-        <w:tc>
-          <w:tcPr>
-            <w:tcW w:w="2200" w:type="dxa"/>
-          </w:tcPr>
-          <w:p>
-            <w:r>
-              <w:rPr>
-                <w:rFonts w:ascii="Arial" w:hAnsi="Arial"/>
-                <w:b/>
-                <w:sz w:val="20"/>
-              </w:rPr>
-              <w:t xml:space="preserve">Steps</w:t>
-            </w:r>
-          </w:p>
-        </w:tc>
-        <w:tc>
-          <w:tcPr>
-            <w:tcW w:w="6430" w:type="dxa"/>
-          </w:tcPr>
-          <w:p>
-            <w:r>
-              <w:rPr>
-                <w:rFonts w:ascii="Arial" w:hAnsi="Arial"/>
-                <w:sz w:val="20"/>
-              </w:rPr>
-              <w:t xml:space="preserve">1. Run manual_password.exe.  2. Type abc123 and observe the screen, then press Enter.  3. Run again, type abc123, press Backspace twice, press Enter.  4. Run again and type more than 64 characters, then press Enter.</w:t>
-            </w:r>
-          </w:p>
-        </w:tc>
-      </w:tr>
-      <w:tr>
-        <w:tc>
-          <w:tcPr>
-            <w:tcW w:w="2200" w:type="dxa"/>
-          </w:tcPr>
-          <w:p>
-            <w:r>
-              <w:rPr>
-                <w:rFonts w:ascii="Arial" w:hAnsi="Arial"/>
-                <w:b/>
-                <w:sz w:val="20"/>
-              </w:rPr>
-              <w:t xml:space="preserve">Expected result</w:t>
-            </w:r>
-          </w:p>
-        </w:tc>
-        <w:tc>
-          <w:tcPr>
-            <w:tcW w:w="6430" w:type="dxa"/>
-          </w:tcPr>
-          <w:p>
-            <w:r>
-              <w:rPr>
-                <w:rFonts w:ascii="Arial" w:hAnsi="Arial"/>
-                <w:sz w:val="20"/>
-              </w:rPr>
-              <w:t xml:space="preserve">Only * characters are shown, never the typed letters. Backspace removes one * each time. The reported length matches the characters kept. Entry stops accepting characters at 64.</w:t>
-            </w:r>
-          </w:p>
-        </w:tc>
-      </w:tr>
-      <w:tr>
-        <w:tc>
-          <w:tcPr>
-            <w:tcW w:w="2200" w:type="dxa"/>
-          </w:tcPr>
-          <w:p>
-            <w:r>
-              <w:rPr>
-                <w:rFonts w:ascii="Arial" w:hAnsi="Arial"/>
-                <w:b/>
-                <w:sz w:val="20"/>
-              </w:rPr>
-              <w:t xml:space="preserve">Actual result</w:t>
-            </w:r>
-          </w:p>
-        </w:tc>
-        <w:tc>
-          <w:tcPr>
-            <w:tcW w:w="6430" w:type="dxa"/>
-          </w:tcPr>
-          <w:p>
-            <w:r>
-              <w:rPr>
-                <w:rFonts w:ascii="Arial" w:hAnsi="Arial"/>
-                <w:sz w:val="20"/>
-              </w:rPr>
-              <w:t xml:space="preserve">Step 2: ****** shown, 6 characters reported. Step 3: **** shown, 4 characters reported. Step 4: capped at 64 characters.</w:t>
-            </w:r>
-          </w:p>
-        </w:tc>
-      </w:tr>
-      <w:tr>
-        <w:tc>
-          <w:tcPr>
-            <w:tcW w:w="2200" w:type="dxa"/>
-          </w:tcPr>
-          <w:p>
-            <w:r>
-              <w:rPr>
-                <w:rFonts w:ascii="Arial" w:hAnsi="Arial"/>
-                <w:b/>
-                <w:sz w:val="20"/>
-              </w:rPr>
-              <w:t xml:space="preserve">Result</w:t>
-            </w:r>
-          </w:p>
-        </w:tc>
-        <w:tc>
-          <w:tcPr>
-            <w:tcW w:w="6430" w:type="dxa"/>
-          </w:tcPr>
-          <w:p>
-            <w:r>
-              <w:rPr>
-                <w:rFonts w:ascii="Arial" w:hAnsi="Arial"/>
-                <w:sz w:val="20"/>
-              </w:rPr>
-              <w:t xml:space="preserve">Pass</w:t>
-            </w:r>
-          </w:p>
-        </w:tc>
-      </w:tr>
-      <w:tr>
-        <w:tc>
-          <w:tcPr>
-            <w:tcW w:w="2200" w:type="dxa"/>
-          </w:tcPr>
-          <w:p>
-            <w:r>
-              <w:rPr>
-                <w:rFonts w:ascii="Arial" w:hAnsi="Arial"/>
-                <w:b/>
-                <w:sz w:val="20"/>
-              </w:rPr>
-              <w:t xml:space="preserve">Evidence</w:t>
-            </w:r>
-          </w:p>
-        </w:tc>
-        <w:tc>
-          <w:tcPr>
-            <w:tcW w:w="6430" w:type="dxa"/>
-          </w:tcPr>
-          <w:p>
-            <w:r>
-              <w:rPr>
-                <w:rFonts w:ascii="Arial" w:hAnsi="Arial"/>
-                <w:sz w:val="20"/>
-              </w:rPr>
-              <w:t xml:space="preserve">docs/manual_test_password_masking.png and docs/manual_test_password_length.png</w:t>
-            </w:r>
-          </w:p>
-        </w:tc>
-      </w:tr>
-      <w:tr>
-        <w:tc>
-          <w:tcPr>
-            <w:tcW w:w="2200" w:type="dxa"/>
-          </w:tcPr>
-          <w:p>
-            <w:r>
-              <w:rPr>
-                <w:rFonts w:ascii="Arial" w:hAnsi="Arial"/>
-                <w:b/>
-                <w:sz w:val="20"/>
-              </w:rPr>
-              <w:t xml:space="preserve">Executed by / date</w:t>
-            </w:r>
-          </w:p>
-        </w:tc>
-        <w:tc>
-          <w:tcPr>
-            <w:tcW w:w="6430" w:type="dxa"/>
-          </w:tcPr>
-          <w:p>
-            <w:r>
-              <w:rPr>
-                <w:rFonts w:ascii="Arial" w:hAnsi="Arial"/>
-                <w:sz w:val="20"/>
-              </w:rPr>
-              <w:t xml:space="preserve">Mem 1 (Jyeshta J), Sprint 1</w:t>
             </w:r>
           </w:p>
         </w:tc>

</xml_diff>